<commit_message>
Upload additional Tugas 4
</commit_message>
<xml_diff>
--- a/Tugas_4_IAP_AutoScheduler.docx
+++ b/Tugas_4_IAP_AutoScheduler.docx
@@ -6,8 +6,6 @@
       <w:pPr>
         <w:jc w:val="center"/>
       </w:pPr>
-      <w:bookmarkStart w:id="0" w:name="_GoBack"/>
-      <w:bookmarkEnd w:id="0"/>
       <w:r>
         <w:rPr>
           <w:b/>
@@ -3887,7 +3885,12 @@
         <w:jc w:val="both"/>
       </w:pPr>
       <w:r>
-        <w:t xml:space="preserve">Workflow Auto Posting Scheduler berhasil dibuat dan diuji. Pemicu 15 menit, pembacaan data Google Sheets, validasi waktu dengan Luxon pada zona Asia/Jakarta, pemulihan </w:t>
+        <w:t>Workflow Aut</w:t>
+      </w:r>
+      <w:bookmarkStart w:id="0" w:name="_GoBack"/>
+      <w:bookmarkEnd w:id="0"/>
+      <w:r>
+        <w:t xml:space="preserve">o Posting Scheduler berhasil dibuat dan diuji. Pemicu 15 menit, pembacaan data Google Sheets, validasi waktu dengan Luxon pada zona Asia/Jakarta, pemulihan </w:t>
       </w:r>
       <w:r>
         <w:rPr>
@@ -3909,7 +3912,10 @@
         <w:pStyle w:val="Heading1"/>
       </w:pPr>
       <w:r>
-        <w:t>Lampiran</w:t>
+        <w:t>L</w:t>
+      </w:r>
+      <w:r>
+        <w:t>ink Github</w:t>
       </w:r>
     </w:p>
     <w:p>
@@ -3920,25 +3926,27 @@
           <w:numId w:val="2"/>
         </w:numPr>
         <w:spacing w:after="60" w:line="300" w:lineRule="auto"/>
-        <w:jc w:val="both"/>
-      </w:pPr>
-      <w:r>
-        <w:t xml:space="preserve">Berkas workflow: </w:t>
-      </w:r>
-      <w:r>
-        <w:rPr>
-          <w:rFonts w:ascii="Courier New" w:eastAsia="Courier New" w:hAnsi="Courier New" w:cs="Courier New"/>
-          <w:sz w:val="22"/>
-          <w:szCs w:val="22"/>
-        </w:rPr>
-        <w:t>Pertemuan_3_Tugas4_AutoScheduler.json</w:t>
-      </w:r>
-      <w:r>
-        <w:t xml:space="preserve"> (dapat diimpor ke n8n).</w:t>
+      </w:pPr>
+      <w:r>
+        <w:t>Berkas workflow:</w:t>
+      </w:r>
+      <w:r>
+        <w:t xml:space="preserve"> </w:t>
+      </w:r>
+      <w:hyperlink r:id="rId18" w:history="1">
+        <w:r>
+          <w:rPr>
+            <w:rStyle w:val="Hyperlink"/>
+          </w:rPr>
+          <w:t>https://github.com/Riansyah96/NFA_Implementasi-AI-Pemasaran/blob/main/Pertemuan_3_Tugas4_AutoScheduler.json</w:t>
+        </w:r>
+      </w:hyperlink>
+      <w:r>
+        <w:t xml:space="preserve"> </w:t>
       </w:r>
     </w:p>
     <w:sectPr>
-      <w:footerReference w:type="default" r:id="rId18"/>
+      <w:footerReference w:type="default" r:id="rId19"/>
       <w:pgSz w:w="11906" w:h="16838"/>
       <w:pgMar w:top="1418" w:right="1134" w:bottom="1418" w:left="1134" w:header="708" w:footer="708" w:gutter="0"/>
       <w:pgNumType w:start="1"/>
@@ -4826,6 +4834,18 @@
       <w:szCs w:val="20"/>
     </w:rPr>
   </w:style>
+  <w:style w:type="character" w:styleId="UnresolvedMention">
+    <w:name w:val="Unresolved Mention"/>
+    <w:basedOn w:val="DefaultParagraphFont"/>
+    <w:uiPriority w:val="99"/>
+    <w:semiHidden/>
+    <w:unhideWhenUsed/>
+    <w:rsid w:val="005E1536"/>
+    <w:rPr>
+      <w:color w:val="605E5C"/>
+      <w:shd w:val="clear" w:color="auto" w:fill="E1DFDD"/>
+    </w:rPr>
+  </w:style>
 </w:styles>
 </file>
 

</xml_diff>